<commit_message>
Ajustes locales de UI y funcionalidad
</commit_message>
<xml_diff>
--- a/public/plantilla_reserva.docx
+++ b/public/plantilla_reserva.docx
@@ -1,6 +1,6 @@
 
 <file path=word/document.xml><?xml version="1.0" encoding="utf-8"?>
-<w:document xmlns:wpc="http://schemas.microsoft.com/office/word/2010/wordprocessingCanvas" xmlns:cx="http://schemas.microsoft.com/office/drawing/2014/chartex" xmlns:cx1="http://schemas.microsoft.com/office/drawing/2015/9/8/chartex" xmlns:cx2="http://schemas.microsoft.com/office/drawing/2015/10/21/chartex" xmlns:cx3="http://schemas.microsoft.com/office/drawing/2016/5/9/chartex" xmlns:cx4="http://schemas.microsoft.com/office/drawing/2016/5/10/chartex" xmlns:cx5="http://schemas.microsoft.com/office/drawing/2016/5/11/chartex" xmlns:cx6="http://schemas.microsoft.com/office/drawing/2016/5/12/chartex" xmlns:cx7="http://schemas.microsoft.com/office/drawing/2016/5/13/chartex" xmlns:cx8="http://schemas.microsoft.com/office/drawing/2016/5/14/chartex" xmlns:mc="http://schemas.openxmlformats.org/markup-compatibility/2006" xmlns:aink="http://schemas.microsoft.com/office/drawing/2016/ink" xmlns:am3d="http://schemas.microsoft.com/office/drawing/2017/model3d" xmlns:o="urn:schemas-microsoft-com:office:office" xmlns:oel="http://schemas.microsoft.com/office/2019/extlst" xmlns:r="http://schemas.openxmlformats.org/officeDocument/2006/relationships" xmlns:m="http://schemas.openxmlformats.org/officeDocument/2006/math" xmlns:v="urn:schemas-microsoft-com:vml" xmlns:wp14="http://schemas.microsoft.com/office/word/2010/wordprocessingDrawing" xmlns:wp="http://schemas.openxmlformats.org/drawingml/2006/wordprocessingDrawing" xmlns:w10="urn:schemas-microsoft-com:office:word" xmlns:w="http://schemas.openxmlformats.org/wordprocessingml/2006/main" xmlns:w14="http://schemas.microsoft.com/office/word/2010/wordml" xmlns:w15="http://schemas.microsoft.com/office/word/2012/wordml" xmlns:w16cex="http://schemas.microsoft.com/office/word/2018/wordml/cex" xmlns:w16cid="http://schemas.microsoft.com/office/word/2016/wordml/cid" xmlns:w16="http://schemas.microsoft.com/office/word/2018/wordml" xmlns:w16sdtdh="http://schemas.microsoft.com/office/word/2020/wordml/sdtdatahash" xmlns:w16se="http://schemas.microsoft.com/office/word/2015/wordml/symex" xmlns:wpg="http://schemas.microsoft.com/office/word/2010/wordprocessingGroup" xmlns:wpi="http://schemas.microsoft.com/office/word/2010/wordprocessingInk" xmlns:wne="http://schemas.microsoft.com/office/word/2006/wordml" xmlns:wps="http://schemas.microsoft.com/office/word/2010/wordprocessingShape" mc:Ignorable="w14 w15 w16se w16cid w16 w16cex w16sdtdh wp14">
+<w:document xmlns:wpc="http://schemas.microsoft.com/office/word/2010/wordprocessingCanvas" xmlns:cx="http://schemas.microsoft.com/office/drawing/2014/chartex" xmlns:cx1="http://schemas.microsoft.com/office/drawing/2015/9/8/chartex" xmlns:cx2="http://schemas.microsoft.com/office/drawing/2015/10/21/chartex" xmlns:cx3="http://schemas.microsoft.com/office/drawing/2016/5/9/chartex" xmlns:cx4="http://schemas.microsoft.com/office/drawing/2016/5/10/chartex" xmlns:cx5="http://schemas.microsoft.com/office/drawing/2016/5/11/chartex" xmlns:cx6="http://schemas.microsoft.com/office/drawing/2016/5/12/chartex" xmlns:cx7="http://schemas.microsoft.com/office/drawing/2016/5/13/chartex" xmlns:cx8="http://schemas.microsoft.com/office/drawing/2016/5/14/chartex" xmlns:mc="http://schemas.openxmlformats.org/markup-compatibility/2006" xmlns:aink="http://schemas.microsoft.com/office/drawing/2016/ink" xmlns:am3d="http://schemas.microsoft.com/office/drawing/2017/model3d" xmlns:o="urn:schemas-microsoft-com:office:office" xmlns:oel="http://schemas.microsoft.com/office/2019/extlst" xmlns:r="http://schemas.openxmlformats.org/officeDocument/2006/relationships" xmlns:m="http://schemas.openxmlformats.org/officeDocument/2006/math" xmlns:v="urn:schemas-microsoft-com:vml" xmlns:wp14="http://schemas.microsoft.com/office/word/2010/wordprocessingDrawing" xmlns:wp="http://schemas.openxmlformats.org/drawingml/2006/wordprocessingDrawing" xmlns:w10="urn:schemas-microsoft-com:office:word" xmlns:w="http://schemas.openxmlformats.org/wordprocessingml/2006/main" xmlns:w14="http://schemas.microsoft.com/office/word/2010/wordml" xmlns:w15="http://schemas.microsoft.com/office/word/2012/wordml" xmlns:w16cex="http://schemas.microsoft.com/office/word/2018/wordml/cex" xmlns:w16cid="http://schemas.microsoft.com/office/word/2016/wordml/cid" xmlns:w16="http://schemas.microsoft.com/office/word/2018/wordml" xmlns:w16du="http://schemas.microsoft.com/office/word/2023/wordml/word16du" xmlns:w16sdtdh="http://schemas.microsoft.com/office/word/2020/wordml/sdtdatahash" xmlns:w16sdtfl="http://schemas.microsoft.com/office/word/2024/wordml/sdtformatlock" xmlns:w16se="http://schemas.microsoft.com/office/word/2015/wordml/symex" xmlns:wpg="http://schemas.microsoft.com/office/word/2010/wordprocessingGroup" xmlns:wpi="http://schemas.microsoft.com/office/word/2010/wordprocessingInk" xmlns:wne="http://schemas.microsoft.com/office/word/2006/wordml" xmlns:wps="http://schemas.microsoft.com/office/word/2010/wordprocessingShape" mc:Ignorable="w14 w15 w16se w16cid w16 w16cex w16sdtdh w16sdtfl w16du wp14">
   <w:body>
     <w:p>
       <w:pPr>
@@ -3650,7 +3650,15 @@
           <w:sz w:val="18"/>
           <w:szCs w:val="18"/>
         </w:rPr>
-        <w:t xml:space="preserve">DON CARLOS ALBERTO ROL MORENO </w:t>
+        <w:t xml:space="preserve">D. </w:t>
+      </w:r>
+      <w:r>
+        <w:rPr>
+          <w:rFonts w:ascii="Montserrat Light" w:hAnsi="Montserrat Light"/>
+          <w:sz w:val="22"/>
+          <w:szCs w:val="22"/>
+        </w:rPr>
+        <w:t>{NOMBRE_COMPRADOR}</w:t>
       </w:r>
     </w:p>
     <w:p>
@@ -3751,129 +3759,279 @@
         </w:rPr>
         <w:tab/>
       </w:r>
+    </w:p>
+    <w:p>
+      <w:pPr>
+        <w:jc w:val="both"/>
+        <w:rPr>
+          <w:rFonts w:ascii="Montserrat Light" w:hAnsi="Montserrat Light"/>
+          <w:sz w:val="22"/>
+          <w:szCs w:val="22"/>
+        </w:rPr>
+      </w:pPr>
+    </w:p>
+    <w:p>
+      <w:pPr>
+        <w:jc w:val="both"/>
+        <w:rPr>
+          <w:rFonts w:ascii="Montserrat Light" w:hAnsi="Montserrat Light"/>
+          <w:sz w:val="22"/>
+          <w:szCs w:val="22"/>
+        </w:rPr>
+      </w:pPr>
+    </w:p>
+    <w:p>
+      <w:pPr>
+        <w:jc w:val="both"/>
+        <w:rPr>
+          <w:rFonts w:ascii="Montserrat Light" w:hAnsi="Montserrat Light"/>
+          <w:sz w:val="22"/>
+          <w:szCs w:val="22"/>
+        </w:rPr>
+      </w:pPr>
+    </w:p>
+    <w:p>
+      <w:pPr>
+        <w:jc w:val="both"/>
+        <w:rPr>
+          <w:rFonts w:ascii="Montserrat Light" w:hAnsi="Montserrat Light"/>
+          <w:sz w:val="22"/>
+          <w:szCs w:val="22"/>
+        </w:rPr>
+      </w:pPr>
+    </w:p>
+    <w:p>
+      <w:pPr>
+        <w:jc w:val="both"/>
+        <w:rPr>
+          <w:rFonts w:ascii="Montserrat Light" w:hAnsi="Montserrat Light"/>
+          <w:sz w:val="22"/>
+          <w:szCs w:val="22"/>
+        </w:rPr>
+      </w:pPr>
+      <w:r>
+        <w:rPr>
+          <w:rFonts w:ascii="Montserrat Light" w:hAnsi="Montserrat Light"/>
+          <w:sz w:val="22"/>
+          <w:szCs w:val="22"/>
+        </w:rPr>
+        <w:t>Acepto expresamente la cláusula de protección de datos TERCERA.</w:t>
+      </w:r>
+    </w:p>
+    <w:p>
+      <w:pPr>
+        <w:jc w:val="both"/>
+        <w:rPr>
+          <w:rFonts w:ascii="Montserrat Light" w:hAnsi="Montserrat Light"/>
+          <w:sz w:val="22"/>
+          <w:szCs w:val="22"/>
+        </w:rPr>
+      </w:pPr>
+    </w:p>
+    <w:p>
+      <w:pPr>
+        <w:jc w:val="both"/>
+        <w:rPr>
+          <w:rFonts w:ascii="Montserrat Light" w:hAnsi="Montserrat Light"/>
+          <w:sz w:val="22"/>
+          <w:szCs w:val="22"/>
+        </w:rPr>
+      </w:pPr>
+    </w:p>
+    <w:p>
+      <w:pPr>
+        <w:jc w:val="both"/>
+        <w:rPr>
+          <w:rFonts w:ascii="Montserrat Light" w:hAnsi="Montserrat Light"/>
+          <w:sz w:val="20"/>
+          <w:szCs w:val="20"/>
+        </w:rPr>
+      </w:pPr>
+    </w:p>
+    <w:p>
+      <w:pPr>
+        <w:jc w:val="both"/>
+        <w:rPr>
+          <w:rFonts w:ascii="Montserrat Light" w:hAnsi="Montserrat Light"/>
+          <w:sz w:val="20"/>
+          <w:szCs w:val="20"/>
+        </w:rPr>
+      </w:pPr>
+    </w:p>
+    <w:p>
+      <w:pPr>
+        <w:jc w:val="both"/>
+        <w:rPr>
+          <w:rFonts w:ascii="Montserrat Light" w:hAnsi="Montserrat Light"/>
+          <w:sz w:val="20"/>
+          <w:szCs w:val="20"/>
+        </w:rPr>
+      </w:pPr>
+      <w:r>
+        <w:rPr>
+          <w:rFonts w:ascii="Montserrat Light" w:hAnsi="Montserrat Light"/>
+          <w:sz w:val="20"/>
+          <w:szCs w:val="20"/>
+        </w:rPr>
+        <w:t xml:space="preserve">Fdo.:   </w:t>
+      </w:r>
+      <w:r>
+        <w:rPr>
+          <w:rFonts w:ascii="Montserrat Light" w:hAnsi="Montserrat Light"/>
+          <w:sz w:val="20"/>
+          <w:szCs w:val="20"/>
+        </w:rPr>
+        <w:t xml:space="preserve">D. </w:t>
+      </w:r>
+      <w:r>
+        <w:rPr>
+          <w:rFonts w:ascii="Montserrat Light" w:hAnsi="Montserrat Light"/>
+          <w:sz w:val="22"/>
+          <w:szCs w:val="22"/>
+        </w:rPr>
+        <w:t>{NOMBRE_COMPRADOR}</w:t>
+      </w:r>
+    </w:p>
+    <w:p>
+      <w:pPr>
+        <w:jc w:val="both"/>
+        <w:rPr>
+          <w:rFonts w:ascii="Montserrat Light" w:hAnsi="Montserrat Light"/>
+          <w:sz w:val="22"/>
+          <w:szCs w:val="22"/>
+        </w:rPr>
+      </w:pPr>
+      <w:r>
+        <w:rPr>
+          <w:rFonts w:ascii="Montserrat Light" w:hAnsi="Montserrat Light"/>
+          <w:sz w:val="22"/>
+          <w:szCs w:val="22"/>
+        </w:rPr>
+        <w:br/>
+      </w:r>
+    </w:p>
+    <w:p>
+      <w:pPr>
+        <w:jc w:val="both"/>
+        <w:rPr>
+          <w:rFonts w:ascii="Montserrat Light" w:hAnsi="Montserrat Light"/>
+          <w:sz w:val="22"/>
+          <w:szCs w:val="22"/>
+        </w:rPr>
+      </w:pPr>
+    </w:p>
+    <w:p>
+      <w:pPr>
+        <w:jc w:val="both"/>
+        <w:rPr>
+          <w:rFonts w:ascii="Montserrat Light" w:hAnsi="Montserrat Light"/>
+          <w:sz w:val="22"/>
+          <w:szCs w:val="22"/>
+        </w:rPr>
+      </w:pPr>
+    </w:p>
+    <w:p>
+      <w:pPr>
+        <w:jc w:val="both"/>
+        <w:rPr>
+          <w:rFonts w:ascii="Montserrat Light" w:hAnsi="Montserrat Light"/>
+          <w:sz w:val="22"/>
+          <w:szCs w:val="22"/>
+        </w:rPr>
+      </w:pPr>
+    </w:p>
+    <w:p>
+      <w:pPr>
+        <w:jc w:val="both"/>
+        <w:rPr>
+          <w:rFonts w:ascii="Montserrat Light" w:hAnsi="Montserrat Light"/>
+          <w:sz w:val="22"/>
+          <w:szCs w:val="22"/>
+        </w:rPr>
+      </w:pPr>
+      <w:r>
+        <w:rPr>
+          <w:rFonts w:ascii="Montserrat Light" w:hAnsi="Montserrat Light"/>
+          <w:sz w:val="22"/>
+          <w:szCs w:val="22"/>
+        </w:rPr>
+        <w:t>Acepto expresamente la cesión de datos contenida en la cláusula de protección de datos TERCERA.</w:t>
+      </w:r>
+    </w:p>
+    <w:p>
+      <w:pPr>
+        <w:jc w:val="both"/>
+        <w:rPr>
+          <w:rFonts w:ascii="Montserrat Light" w:hAnsi="Montserrat Light"/>
+          <w:sz w:val="22"/>
+          <w:szCs w:val="22"/>
+        </w:rPr>
+      </w:pPr>
+    </w:p>
+    <w:p>
+      <w:pPr>
+        <w:jc w:val="both"/>
+        <w:rPr>
+          <w:rFonts w:ascii="Montserrat Light" w:hAnsi="Montserrat Light"/>
+          <w:sz w:val="22"/>
+          <w:szCs w:val="22"/>
+        </w:rPr>
+      </w:pPr>
+    </w:p>
+    <w:p>
+      <w:pPr>
+        <w:jc w:val="both"/>
+        <w:rPr>
+          <w:rFonts w:ascii="Montserrat Light" w:hAnsi="Montserrat Light"/>
+          <w:sz w:val="22"/>
+          <w:szCs w:val="22"/>
+        </w:rPr>
+      </w:pPr>
+    </w:p>
+    <w:p>
+      <w:pPr>
+        <w:jc w:val="both"/>
+        <w:rPr>
+          <w:rFonts w:ascii="Montserrat Light" w:hAnsi="Montserrat Light"/>
+          <w:sz w:val="22"/>
+          <w:szCs w:val="22"/>
+        </w:rPr>
+      </w:pPr>
+    </w:p>
+    <w:p>
+      <w:pPr>
+        <w:jc w:val="both"/>
+        <w:rPr>
+          <w:rFonts w:ascii="Montserrat Light" w:hAnsi="Montserrat Light"/>
+          <w:sz w:val="20"/>
+          <w:szCs w:val="20"/>
+        </w:rPr>
+      </w:pPr>
+    </w:p>
+    <w:p>
+      <w:pPr>
+        <w:jc w:val="both"/>
+        <w:rPr>
+          <w:rFonts w:ascii="Montserrat Light" w:hAnsi="Montserrat Light"/>
+          <w:sz w:val="20"/>
+          <w:szCs w:val="20"/>
+        </w:rPr>
+      </w:pPr>
+      <w:r>
+        <w:rPr>
+          <w:rFonts w:ascii="Montserrat Light" w:hAnsi="Montserrat Light"/>
+          <w:sz w:val="20"/>
+          <w:szCs w:val="20"/>
+        </w:rPr>
+        <w:t xml:space="preserve">Fdo.:   </w:t>
+      </w:r>
       <w:r>
         <w:rPr>
           <w:rFonts w:ascii="Montserrat Light" w:hAnsi="Montserrat Light"/>
           <w:sz w:val="18"/>
           <w:szCs w:val="18"/>
         </w:rPr>
-        <w:t>DOÑA ESTEFANÍA NISTAL CALVO</w:t>
-      </w:r>
-    </w:p>
-    <w:p>
-      <w:pPr>
-        <w:jc w:val="both"/>
-        <w:rPr>
-          <w:rFonts w:ascii="Montserrat Light" w:hAnsi="Montserrat Light"/>
-          <w:sz w:val="22"/>
-          <w:szCs w:val="22"/>
-        </w:rPr>
-      </w:pPr>
-    </w:p>
-    <w:p>
-      <w:pPr>
-        <w:jc w:val="both"/>
-        <w:rPr>
-          <w:rFonts w:ascii="Montserrat Light" w:hAnsi="Montserrat Light"/>
-          <w:sz w:val="22"/>
-          <w:szCs w:val="22"/>
-        </w:rPr>
-      </w:pPr>
-    </w:p>
-    <w:p>
-      <w:pPr>
-        <w:jc w:val="both"/>
-        <w:rPr>
-          <w:rFonts w:ascii="Montserrat Light" w:hAnsi="Montserrat Light"/>
-          <w:sz w:val="22"/>
-          <w:szCs w:val="22"/>
-        </w:rPr>
-      </w:pPr>
-    </w:p>
-    <w:p>
-      <w:pPr>
-        <w:jc w:val="both"/>
-        <w:rPr>
-          <w:rFonts w:ascii="Montserrat Light" w:hAnsi="Montserrat Light"/>
-          <w:sz w:val="22"/>
-          <w:szCs w:val="22"/>
-        </w:rPr>
-      </w:pPr>
-    </w:p>
-    <w:p>
-      <w:pPr>
-        <w:jc w:val="both"/>
-        <w:rPr>
-          <w:rFonts w:ascii="Montserrat Light" w:hAnsi="Montserrat Light"/>
-          <w:sz w:val="22"/>
-          <w:szCs w:val="22"/>
-        </w:rPr>
-      </w:pPr>
-      <w:r>
-        <w:rPr>
-          <w:rFonts w:ascii="Montserrat Light" w:hAnsi="Montserrat Light"/>
-          <w:sz w:val="22"/>
-          <w:szCs w:val="22"/>
-        </w:rPr>
-        <w:t>Acepto expresamente la cláusula de protección de datos TERCERA.</w:t>
-      </w:r>
-    </w:p>
-    <w:p>
-      <w:pPr>
-        <w:jc w:val="both"/>
-        <w:rPr>
-          <w:rFonts w:ascii="Montserrat Light" w:hAnsi="Montserrat Light"/>
-          <w:sz w:val="22"/>
-          <w:szCs w:val="22"/>
-        </w:rPr>
-      </w:pPr>
-    </w:p>
-    <w:p>
-      <w:pPr>
-        <w:jc w:val="both"/>
-        <w:rPr>
-          <w:rFonts w:ascii="Montserrat Light" w:hAnsi="Montserrat Light"/>
-          <w:sz w:val="22"/>
-          <w:szCs w:val="22"/>
-        </w:rPr>
-      </w:pPr>
-    </w:p>
-    <w:p>
-      <w:pPr>
-        <w:jc w:val="both"/>
-        <w:rPr>
-          <w:rFonts w:ascii="Montserrat Light" w:hAnsi="Montserrat Light"/>
-          <w:sz w:val="20"/>
-          <w:szCs w:val="20"/>
-        </w:rPr>
-      </w:pPr>
-    </w:p>
-    <w:p>
-      <w:pPr>
-        <w:jc w:val="both"/>
-        <w:rPr>
-          <w:rFonts w:ascii="Montserrat Light" w:hAnsi="Montserrat Light"/>
-          <w:sz w:val="20"/>
-          <w:szCs w:val="20"/>
-        </w:rPr>
-      </w:pPr>
-    </w:p>
-    <w:p>
-      <w:pPr>
-        <w:jc w:val="both"/>
-        <w:rPr>
-          <w:rFonts w:ascii="Montserrat Light" w:hAnsi="Montserrat Light"/>
-          <w:sz w:val="20"/>
-          <w:szCs w:val="20"/>
-        </w:rPr>
-      </w:pPr>
-      <w:r>
-        <w:rPr>
-          <w:rFonts w:ascii="Montserrat Light" w:hAnsi="Montserrat Light"/>
-          <w:sz w:val="20"/>
-          <w:szCs w:val="20"/>
-        </w:rPr>
-        <w:t xml:space="preserve">Fdo.:   </w:t>
+        <w:t>D</w:t>
       </w:r>
       <w:r>
         <w:rPr>
@@ -3881,206 +4039,15 @@
           <w:sz w:val="18"/>
           <w:szCs w:val="18"/>
         </w:rPr>
-        <w:t>DON CARLOS ALBERTO ROL MORENO</w:t>
-      </w:r>
-      <w:r>
-        <w:rPr>
-          <w:rFonts w:ascii="Montserrat Light" w:hAnsi="Montserrat Light"/>
-          <w:sz w:val="18"/>
-          <w:szCs w:val="18"/>
-        </w:rPr>
-        <w:tab/>
-      </w:r>
-      <w:r>
-        <w:rPr>
-          <w:rFonts w:ascii="Montserrat Light" w:hAnsi="Montserrat Light"/>
-          <w:sz w:val="18"/>
-          <w:szCs w:val="18"/>
-        </w:rPr>
-        <w:t xml:space="preserve"> </w:t>
-      </w:r>
-      <w:r>
-        <w:rPr>
-          <w:rFonts w:ascii="Montserrat Light" w:hAnsi="Montserrat Light"/>
-          <w:sz w:val="20"/>
-          <w:szCs w:val="20"/>
-        </w:rPr>
-        <w:t xml:space="preserve">Fdo.:   </w:t>
-      </w:r>
-      <w:r>
-        <w:rPr>
-          <w:rFonts w:ascii="Montserrat Light" w:hAnsi="Montserrat Light"/>
-          <w:sz w:val="18"/>
-          <w:szCs w:val="18"/>
-        </w:rPr>
-        <w:t>DOÑA ESTEFANÍA NISTAL CALVO</w:t>
-      </w:r>
-    </w:p>
-    <w:p>
-      <w:pPr>
-        <w:jc w:val="both"/>
-        <w:rPr>
-          <w:rFonts w:ascii="Montserrat Light" w:hAnsi="Montserrat Light"/>
-          <w:sz w:val="22"/>
-          <w:szCs w:val="22"/>
-        </w:rPr>
-      </w:pPr>
-      <w:r>
-        <w:rPr>
-          <w:rFonts w:ascii="Montserrat Light" w:hAnsi="Montserrat Light"/>
-          <w:sz w:val="22"/>
-          <w:szCs w:val="22"/>
-        </w:rPr>
-        <w:br/>
-      </w:r>
-    </w:p>
-    <w:p>
-      <w:pPr>
-        <w:jc w:val="both"/>
-        <w:rPr>
-          <w:rFonts w:ascii="Montserrat Light" w:hAnsi="Montserrat Light"/>
-          <w:sz w:val="22"/>
-          <w:szCs w:val="22"/>
-        </w:rPr>
-      </w:pPr>
-    </w:p>
-    <w:p>
-      <w:pPr>
-        <w:jc w:val="both"/>
-        <w:rPr>
-          <w:rFonts w:ascii="Montserrat Light" w:hAnsi="Montserrat Light"/>
-          <w:sz w:val="22"/>
-          <w:szCs w:val="22"/>
-        </w:rPr>
-      </w:pPr>
-    </w:p>
-    <w:p>
-      <w:pPr>
-        <w:jc w:val="both"/>
-        <w:rPr>
-          <w:rFonts w:ascii="Montserrat Light" w:hAnsi="Montserrat Light"/>
-          <w:sz w:val="22"/>
-          <w:szCs w:val="22"/>
-        </w:rPr>
-      </w:pPr>
-    </w:p>
-    <w:p>
-      <w:pPr>
-        <w:jc w:val="both"/>
-        <w:rPr>
-          <w:rFonts w:ascii="Montserrat Light" w:hAnsi="Montserrat Light"/>
-          <w:sz w:val="22"/>
-          <w:szCs w:val="22"/>
-        </w:rPr>
-      </w:pPr>
-      <w:r>
-        <w:rPr>
-          <w:rFonts w:ascii="Montserrat Light" w:hAnsi="Montserrat Light"/>
-          <w:sz w:val="22"/>
-          <w:szCs w:val="22"/>
-        </w:rPr>
-        <w:t>Acepto expresamente la cesión de datos contenida en la cláusula de protección de datos TERCERA.</w:t>
-      </w:r>
-    </w:p>
-    <w:p>
-      <w:pPr>
-        <w:jc w:val="both"/>
-        <w:rPr>
-          <w:rFonts w:ascii="Montserrat Light" w:hAnsi="Montserrat Light"/>
-          <w:sz w:val="22"/>
-          <w:szCs w:val="22"/>
-        </w:rPr>
-      </w:pPr>
-    </w:p>
-    <w:p>
-      <w:pPr>
-        <w:jc w:val="both"/>
-        <w:rPr>
-          <w:rFonts w:ascii="Montserrat Light" w:hAnsi="Montserrat Light"/>
-          <w:sz w:val="22"/>
-          <w:szCs w:val="22"/>
-        </w:rPr>
-      </w:pPr>
-    </w:p>
-    <w:p>
-      <w:pPr>
-        <w:jc w:val="both"/>
-        <w:rPr>
-          <w:rFonts w:ascii="Montserrat Light" w:hAnsi="Montserrat Light"/>
-          <w:sz w:val="22"/>
-          <w:szCs w:val="22"/>
-        </w:rPr>
-      </w:pPr>
-    </w:p>
-    <w:p>
-      <w:pPr>
-        <w:jc w:val="both"/>
-        <w:rPr>
-          <w:rFonts w:ascii="Montserrat Light" w:hAnsi="Montserrat Light"/>
-          <w:sz w:val="22"/>
-          <w:szCs w:val="22"/>
-        </w:rPr>
-      </w:pPr>
-    </w:p>
-    <w:p>
-      <w:pPr>
-        <w:jc w:val="both"/>
-        <w:rPr>
-          <w:rFonts w:ascii="Montserrat Light" w:hAnsi="Montserrat Light"/>
-          <w:sz w:val="20"/>
-          <w:szCs w:val="20"/>
-        </w:rPr>
-      </w:pPr>
-    </w:p>
-    <w:p>
-      <w:pPr>
-        <w:jc w:val="both"/>
-        <w:rPr>
-          <w:rFonts w:ascii="Montserrat Light" w:hAnsi="Montserrat Light"/>
-          <w:sz w:val="20"/>
-          <w:szCs w:val="20"/>
-        </w:rPr>
-      </w:pPr>
-      <w:r>
-        <w:rPr>
-          <w:rFonts w:ascii="Montserrat Light" w:hAnsi="Montserrat Light"/>
-          <w:sz w:val="20"/>
-          <w:szCs w:val="20"/>
-        </w:rPr>
-        <w:t xml:space="preserve">Fdo.:   </w:t>
-      </w:r>
-      <w:r>
-        <w:rPr>
-          <w:rFonts w:ascii="Montserrat Light" w:hAnsi="Montserrat Light"/>
-          <w:sz w:val="18"/>
-          <w:szCs w:val="18"/>
-        </w:rPr>
-        <w:t xml:space="preserve">DON CARLOS ALBERTO ROL MORENO </w:t>
-      </w:r>
-      <w:r>
-        <w:rPr>
-          <w:rFonts w:ascii="Montserrat Light" w:hAnsi="Montserrat Light"/>
-          <w:sz w:val="18"/>
-          <w:szCs w:val="18"/>
-        </w:rPr>
-        <w:tab/>
-        <w:t>F</w:t>
-      </w:r>
-      <w:r>
-        <w:rPr>
-          <w:rFonts w:ascii="Montserrat Light" w:hAnsi="Montserrat Light"/>
-          <w:sz w:val="20"/>
-          <w:szCs w:val="20"/>
-        </w:rPr>
-        <w:t xml:space="preserve">do.:   </w:t>
-      </w:r>
-      <w:r>
-        <w:rPr>
-          <w:rFonts w:ascii="Montserrat Light" w:hAnsi="Montserrat Light"/>
-          <w:sz w:val="18"/>
-          <w:szCs w:val="18"/>
-        </w:rPr>
-        <w:t>DOÑA ESTEFANÍA NISTAL CALVO</w:t>
+        <w:t xml:space="preserve">. </w:t>
+      </w:r>
+      <w:r>
+        <w:rPr>
+          <w:rFonts w:ascii="Montserrat Light" w:hAnsi="Montserrat Light"/>
+          <w:sz w:val="22"/>
+          <w:szCs w:val="22"/>
+        </w:rPr>
+        <w:t>{NOMBRE_COMPRADOR}</w:t>
       </w:r>
     </w:p>
     <w:p>
@@ -4106,7 +4073,7 @@
 </file>
 
 <file path=word/endnotes.xml><?xml version="1.0" encoding="utf-8"?>
-<w:endnotes xmlns:wpc="http://schemas.microsoft.com/office/word/2010/wordprocessingCanvas" xmlns:cx="http://schemas.microsoft.com/office/drawing/2014/chartex" xmlns:cx1="http://schemas.microsoft.com/office/drawing/2015/9/8/chartex" xmlns:cx2="http://schemas.microsoft.com/office/drawing/2015/10/21/chartex" xmlns:cx3="http://schemas.microsoft.com/office/drawing/2016/5/9/chartex" xmlns:cx4="http://schemas.microsoft.com/office/drawing/2016/5/10/chartex" xmlns:cx5="http://schemas.microsoft.com/office/drawing/2016/5/11/chartex" xmlns:cx6="http://schemas.microsoft.com/office/drawing/2016/5/12/chartex" xmlns:cx7="http://schemas.microsoft.com/office/drawing/2016/5/13/chartex" xmlns:cx8="http://schemas.microsoft.com/office/drawing/2016/5/14/chartex" xmlns:mc="http://schemas.openxmlformats.org/markup-compatibility/2006" xmlns:aink="http://schemas.microsoft.com/office/drawing/2016/ink" xmlns:am3d="http://schemas.microsoft.com/office/drawing/2017/model3d" xmlns:o="urn:schemas-microsoft-com:office:office" xmlns:oel="http://schemas.microsoft.com/office/2019/extlst" xmlns:r="http://schemas.openxmlformats.org/officeDocument/2006/relationships" xmlns:m="http://schemas.openxmlformats.org/officeDocument/2006/math" xmlns:v="urn:schemas-microsoft-com:vml" xmlns:wp14="http://schemas.microsoft.com/office/word/2010/wordprocessingDrawing" xmlns:wp="http://schemas.openxmlformats.org/drawingml/2006/wordprocessingDrawing" xmlns:w10="urn:schemas-microsoft-com:office:word" xmlns:w="http://schemas.openxmlformats.org/wordprocessingml/2006/main" xmlns:w14="http://schemas.microsoft.com/office/word/2010/wordml" xmlns:w15="http://schemas.microsoft.com/office/word/2012/wordml" xmlns:w16cex="http://schemas.microsoft.com/office/word/2018/wordml/cex" xmlns:w16cid="http://schemas.microsoft.com/office/word/2016/wordml/cid" xmlns:w16="http://schemas.microsoft.com/office/word/2018/wordml" xmlns:w16sdtdh="http://schemas.microsoft.com/office/word/2020/wordml/sdtdatahash" xmlns:w16se="http://schemas.microsoft.com/office/word/2015/wordml/symex" xmlns:wpg="http://schemas.microsoft.com/office/word/2010/wordprocessingGroup" xmlns:wpi="http://schemas.microsoft.com/office/word/2010/wordprocessingInk" xmlns:wne="http://schemas.microsoft.com/office/word/2006/wordml" xmlns:wps="http://schemas.microsoft.com/office/word/2010/wordprocessingShape" mc:Ignorable="w14 w15 w16se w16cid w16 w16cex w16sdtdh wp14">
+<w:endnotes xmlns:wpc="http://schemas.microsoft.com/office/word/2010/wordprocessingCanvas" xmlns:cx="http://schemas.microsoft.com/office/drawing/2014/chartex" xmlns:cx1="http://schemas.microsoft.com/office/drawing/2015/9/8/chartex" xmlns:cx2="http://schemas.microsoft.com/office/drawing/2015/10/21/chartex" xmlns:cx3="http://schemas.microsoft.com/office/drawing/2016/5/9/chartex" xmlns:cx4="http://schemas.microsoft.com/office/drawing/2016/5/10/chartex" xmlns:cx5="http://schemas.microsoft.com/office/drawing/2016/5/11/chartex" xmlns:cx6="http://schemas.microsoft.com/office/drawing/2016/5/12/chartex" xmlns:cx7="http://schemas.microsoft.com/office/drawing/2016/5/13/chartex" xmlns:cx8="http://schemas.microsoft.com/office/drawing/2016/5/14/chartex" xmlns:mc="http://schemas.openxmlformats.org/markup-compatibility/2006" xmlns:aink="http://schemas.microsoft.com/office/drawing/2016/ink" xmlns:am3d="http://schemas.microsoft.com/office/drawing/2017/model3d" xmlns:o="urn:schemas-microsoft-com:office:office" xmlns:oel="http://schemas.microsoft.com/office/2019/extlst" xmlns:r="http://schemas.openxmlformats.org/officeDocument/2006/relationships" xmlns:m="http://schemas.openxmlformats.org/officeDocument/2006/math" xmlns:v="urn:schemas-microsoft-com:vml" xmlns:wp14="http://schemas.microsoft.com/office/word/2010/wordprocessingDrawing" xmlns:wp="http://schemas.openxmlformats.org/drawingml/2006/wordprocessingDrawing" xmlns:w10="urn:schemas-microsoft-com:office:word" xmlns:w="http://schemas.openxmlformats.org/wordprocessingml/2006/main" xmlns:w14="http://schemas.microsoft.com/office/word/2010/wordml" xmlns:w15="http://schemas.microsoft.com/office/word/2012/wordml" xmlns:w16cex="http://schemas.microsoft.com/office/word/2018/wordml/cex" xmlns:w16cid="http://schemas.microsoft.com/office/word/2016/wordml/cid" xmlns:w16="http://schemas.microsoft.com/office/word/2018/wordml" xmlns:w16du="http://schemas.microsoft.com/office/word/2023/wordml/word16du" xmlns:w16sdtdh="http://schemas.microsoft.com/office/word/2020/wordml/sdtdatahash" xmlns:w16sdtfl="http://schemas.microsoft.com/office/word/2024/wordml/sdtformatlock" xmlns:w16se="http://schemas.microsoft.com/office/word/2015/wordml/symex" xmlns:wpg="http://schemas.microsoft.com/office/word/2010/wordprocessingGroup" xmlns:wpi="http://schemas.microsoft.com/office/word/2010/wordprocessingInk" xmlns:wne="http://schemas.microsoft.com/office/word/2006/wordml" xmlns:wps="http://schemas.microsoft.com/office/word/2010/wordprocessingShape" mc:Ignorable="w14 w15 w16se w16cid w16 w16cex w16sdtdh w16sdtfl w16du wp14">
   <w:endnote w:type="separator" w:id="-1">
     <w:p>
       <w:r>
@@ -4125,7 +4092,7 @@
 </file>
 
 <file path=word/footer1.xml><?xml version="1.0" encoding="utf-8"?>
-<w:ftr xmlns:wpc="http://schemas.microsoft.com/office/word/2010/wordprocessingCanvas" xmlns:cx="http://schemas.microsoft.com/office/drawing/2014/chartex" xmlns:cx1="http://schemas.microsoft.com/office/drawing/2015/9/8/chartex" xmlns:cx2="http://schemas.microsoft.com/office/drawing/2015/10/21/chartex" xmlns:cx3="http://schemas.microsoft.com/office/drawing/2016/5/9/chartex" xmlns:cx4="http://schemas.microsoft.com/office/drawing/2016/5/10/chartex" xmlns:cx5="http://schemas.microsoft.com/office/drawing/2016/5/11/chartex" xmlns:cx6="http://schemas.microsoft.com/office/drawing/2016/5/12/chartex" xmlns:cx7="http://schemas.microsoft.com/office/drawing/2016/5/13/chartex" xmlns:cx8="http://schemas.microsoft.com/office/drawing/2016/5/14/chartex" xmlns:mc="http://schemas.openxmlformats.org/markup-compatibility/2006" xmlns:aink="http://schemas.microsoft.com/office/drawing/2016/ink" xmlns:am3d="http://schemas.microsoft.com/office/drawing/2017/model3d" xmlns:o="urn:schemas-microsoft-com:office:office" xmlns:oel="http://schemas.microsoft.com/office/2019/extlst" xmlns:r="http://schemas.openxmlformats.org/officeDocument/2006/relationships" xmlns:m="http://schemas.openxmlformats.org/officeDocument/2006/math" xmlns:v="urn:schemas-microsoft-com:vml" xmlns:wp14="http://schemas.microsoft.com/office/word/2010/wordprocessingDrawing" xmlns:wp="http://schemas.openxmlformats.org/drawingml/2006/wordprocessingDrawing" xmlns:w10="urn:schemas-microsoft-com:office:word" xmlns:w="http://schemas.openxmlformats.org/wordprocessingml/2006/main" xmlns:w14="http://schemas.microsoft.com/office/word/2010/wordml" xmlns:w15="http://schemas.microsoft.com/office/word/2012/wordml" xmlns:w16cex="http://schemas.microsoft.com/office/word/2018/wordml/cex" xmlns:w16cid="http://schemas.microsoft.com/office/word/2016/wordml/cid" xmlns:w16="http://schemas.microsoft.com/office/word/2018/wordml" xmlns:w16sdtdh="http://schemas.microsoft.com/office/word/2020/wordml/sdtdatahash" xmlns:w16se="http://schemas.microsoft.com/office/word/2015/wordml/symex" xmlns:wpg="http://schemas.microsoft.com/office/word/2010/wordprocessingGroup" xmlns:wpi="http://schemas.microsoft.com/office/word/2010/wordprocessingInk" xmlns:wne="http://schemas.microsoft.com/office/word/2006/wordml" xmlns:wps="http://schemas.microsoft.com/office/word/2010/wordprocessingShape" mc:Ignorable="w14 w15 w16se w16cid w16 w16cex w16sdtdh wp14">
+<w:ftr xmlns:wpc="http://schemas.microsoft.com/office/word/2010/wordprocessingCanvas" xmlns:cx="http://schemas.microsoft.com/office/drawing/2014/chartex" xmlns:cx1="http://schemas.microsoft.com/office/drawing/2015/9/8/chartex" xmlns:cx2="http://schemas.microsoft.com/office/drawing/2015/10/21/chartex" xmlns:cx3="http://schemas.microsoft.com/office/drawing/2016/5/9/chartex" xmlns:cx4="http://schemas.microsoft.com/office/drawing/2016/5/10/chartex" xmlns:cx5="http://schemas.microsoft.com/office/drawing/2016/5/11/chartex" xmlns:cx6="http://schemas.microsoft.com/office/drawing/2016/5/12/chartex" xmlns:cx7="http://schemas.microsoft.com/office/drawing/2016/5/13/chartex" xmlns:cx8="http://schemas.microsoft.com/office/drawing/2016/5/14/chartex" xmlns:mc="http://schemas.openxmlformats.org/markup-compatibility/2006" xmlns:aink="http://schemas.microsoft.com/office/drawing/2016/ink" xmlns:am3d="http://schemas.microsoft.com/office/drawing/2017/model3d" xmlns:o="urn:schemas-microsoft-com:office:office" xmlns:oel="http://schemas.microsoft.com/office/2019/extlst" xmlns:r="http://schemas.openxmlformats.org/officeDocument/2006/relationships" xmlns:m="http://schemas.openxmlformats.org/officeDocument/2006/math" xmlns:v="urn:schemas-microsoft-com:vml" xmlns:wp14="http://schemas.microsoft.com/office/word/2010/wordprocessingDrawing" xmlns:wp="http://schemas.openxmlformats.org/drawingml/2006/wordprocessingDrawing" xmlns:w10="urn:schemas-microsoft-com:office:word" xmlns:w="http://schemas.openxmlformats.org/wordprocessingml/2006/main" xmlns:w14="http://schemas.microsoft.com/office/word/2010/wordml" xmlns:w15="http://schemas.microsoft.com/office/word/2012/wordml" xmlns:w16cex="http://schemas.microsoft.com/office/word/2018/wordml/cex" xmlns:w16cid="http://schemas.microsoft.com/office/word/2016/wordml/cid" xmlns:w16="http://schemas.microsoft.com/office/word/2018/wordml" xmlns:w16du="http://schemas.microsoft.com/office/word/2023/wordml/word16du" xmlns:w16sdtdh="http://schemas.microsoft.com/office/word/2020/wordml/sdtdatahash" xmlns:w16sdtfl="http://schemas.microsoft.com/office/word/2024/wordml/sdtformatlock" xmlns:w16se="http://schemas.microsoft.com/office/word/2015/wordml/symex" xmlns:wpg="http://schemas.microsoft.com/office/word/2010/wordprocessingGroup" xmlns:wpi="http://schemas.microsoft.com/office/word/2010/wordprocessingInk" xmlns:wne="http://schemas.microsoft.com/office/word/2006/wordml" xmlns:wps="http://schemas.microsoft.com/office/word/2010/wordprocessingShape" mc:Ignorable="w14 w15 w16se w16cid w16 w16cex w16sdtdh w16sdtfl w16du wp14">
   <w:p>
     <w:pPr>
       <w:pStyle w:val="Cuerpo"/>
@@ -4302,7 +4269,7 @@
 </file>
 
 <file path=word/footnotes.xml><?xml version="1.0" encoding="utf-8"?>
-<w:footnotes xmlns:wpc="http://schemas.microsoft.com/office/word/2010/wordprocessingCanvas" xmlns:cx="http://schemas.microsoft.com/office/drawing/2014/chartex" xmlns:cx1="http://schemas.microsoft.com/office/drawing/2015/9/8/chartex" xmlns:cx2="http://schemas.microsoft.com/office/drawing/2015/10/21/chartex" xmlns:cx3="http://schemas.microsoft.com/office/drawing/2016/5/9/chartex" xmlns:cx4="http://schemas.microsoft.com/office/drawing/2016/5/10/chartex" xmlns:cx5="http://schemas.microsoft.com/office/drawing/2016/5/11/chartex" xmlns:cx6="http://schemas.microsoft.com/office/drawing/2016/5/12/chartex" xmlns:cx7="http://schemas.microsoft.com/office/drawing/2016/5/13/chartex" xmlns:cx8="http://schemas.microsoft.com/office/drawing/2016/5/14/chartex" xmlns:mc="http://schemas.openxmlformats.org/markup-compatibility/2006" xmlns:aink="http://schemas.microsoft.com/office/drawing/2016/ink" xmlns:am3d="http://schemas.microsoft.com/office/drawing/2017/model3d" xmlns:o="urn:schemas-microsoft-com:office:office" xmlns:oel="http://schemas.microsoft.com/office/2019/extlst" xmlns:r="http://schemas.openxmlformats.org/officeDocument/2006/relationships" xmlns:m="http://schemas.openxmlformats.org/officeDocument/2006/math" xmlns:v="urn:schemas-microsoft-com:vml" xmlns:wp14="http://schemas.microsoft.com/office/word/2010/wordprocessingDrawing" xmlns:wp="http://schemas.openxmlformats.org/drawingml/2006/wordprocessingDrawing" xmlns:w10="urn:schemas-microsoft-com:office:word" xmlns:w="http://schemas.openxmlformats.org/wordprocessingml/2006/main" xmlns:w14="http://schemas.microsoft.com/office/word/2010/wordml" xmlns:w15="http://schemas.microsoft.com/office/word/2012/wordml" xmlns:w16cex="http://schemas.microsoft.com/office/word/2018/wordml/cex" xmlns:w16cid="http://schemas.microsoft.com/office/word/2016/wordml/cid" xmlns:w16="http://schemas.microsoft.com/office/word/2018/wordml" xmlns:w16sdtdh="http://schemas.microsoft.com/office/word/2020/wordml/sdtdatahash" xmlns:w16se="http://schemas.microsoft.com/office/word/2015/wordml/symex" xmlns:wpg="http://schemas.microsoft.com/office/word/2010/wordprocessingGroup" xmlns:wpi="http://schemas.microsoft.com/office/word/2010/wordprocessingInk" xmlns:wne="http://schemas.microsoft.com/office/word/2006/wordml" xmlns:wps="http://schemas.microsoft.com/office/word/2010/wordprocessingShape" mc:Ignorable="w14 w15 w16se w16cid w16 w16cex w16sdtdh wp14">
+<w:footnotes xmlns:wpc="http://schemas.microsoft.com/office/word/2010/wordprocessingCanvas" xmlns:cx="http://schemas.microsoft.com/office/drawing/2014/chartex" xmlns:cx1="http://schemas.microsoft.com/office/drawing/2015/9/8/chartex" xmlns:cx2="http://schemas.microsoft.com/office/drawing/2015/10/21/chartex" xmlns:cx3="http://schemas.microsoft.com/office/drawing/2016/5/9/chartex" xmlns:cx4="http://schemas.microsoft.com/office/drawing/2016/5/10/chartex" xmlns:cx5="http://schemas.microsoft.com/office/drawing/2016/5/11/chartex" xmlns:cx6="http://schemas.microsoft.com/office/drawing/2016/5/12/chartex" xmlns:cx7="http://schemas.microsoft.com/office/drawing/2016/5/13/chartex" xmlns:cx8="http://schemas.microsoft.com/office/drawing/2016/5/14/chartex" xmlns:mc="http://schemas.openxmlformats.org/markup-compatibility/2006" xmlns:aink="http://schemas.microsoft.com/office/drawing/2016/ink" xmlns:am3d="http://schemas.microsoft.com/office/drawing/2017/model3d" xmlns:o="urn:schemas-microsoft-com:office:office" xmlns:oel="http://schemas.microsoft.com/office/2019/extlst" xmlns:r="http://schemas.openxmlformats.org/officeDocument/2006/relationships" xmlns:m="http://schemas.openxmlformats.org/officeDocument/2006/math" xmlns:v="urn:schemas-microsoft-com:vml" xmlns:wp14="http://schemas.microsoft.com/office/word/2010/wordprocessingDrawing" xmlns:wp="http://schemas.openxmlformats.org/drawingml/2006/wordprocessingDrawing" xmlns:w10="urn:schemas-microsoft-com:office:word" xmlns:w="http://schemas.openxmlformats.org/wordprocessingml/2006/main" xmlns:w14="http://schemas.microsoft.com/office/word/2010/wordml" xmlns:w15="http://schemas.microsoft.com/office/word/2012/wordml" xmlns:w16cex="http://schemas.microsoft.com/office/word/2018/wordml/cex" xmlns:w16cid="http://schemas.microsoft.com/office/word/2016/wordml/cid" xmlns:w16="http://schemas.microsoft.com/office/word/2018/wordml" xmlns:w16du="http://schemas.microsoft.com/office/word/2023/wordml/word16du" xmlns:w16sdtdh="http://schemas.microsoft.com/office/word/2020/wordml/sdtdatahash" xmlns:w16sdtfl="http://schemas.microsoft.com/office/word/2024/wordml/sdtformatlock" xmlns:w16se="http://schemas.microsoft.com/office/word/2015/wordml/symex" xmlns:wpg="http://schemas.microsoft.com/office/word/2010/wordprocessingGroup" xmlns:wpi="http://schemas.microsoft.com/office/word/2010/wordprocessingInk" xmlns:wne="http://schemas.microsoft.com/office/word/2006/wordml" xmlns:wps="http://schemas.microsoft.com/office/word/2010/wordprocessingShape" mc:Ignorable="w14 w15 w16se w16cid w16 w16cex w16sdtdh w16sdtfl w16du wp14">
   <w:footnote w:type="separator" w:id="-1">
     <w:p>
       <w:r>
@@ -4321,7 +4288,7 @@
 </file>
 
 <file path=word/header1.xml><?xml version="1.0" encoding="utf-8"?>
-<w:hdr xmlns:wpc="http://schemas.microsoft.com/office/word/2010/wordprocessingCanvas" xmlns:cx="http://schemas.microsoft.com/office/drawing/2014/chartex" xmlns:cx1="http://schemas.microsoft.com/office/drawing/2015/9/8/chartex" xmlns:cx2="http://schemas.microsoft.com/office/drawing/2015/10/21/chartex" xmlns:cx3="http://schemas.microsoft.com/office/drawing/2016/5/9/chartex" xmlns:cx4="http://schemas.microsoft.com/office/drawing/2016/5/10/chartex" xmlns:cx5="http://schemas.microsoft.com/office/drawing/2016/5/11/chartex" xmlns:cx6="http://schemas.microsoft.com/office/drawing/2016/5/12/chartex" xmlns:cx7="http://schemas.microsoft.com/office/drawing/2016/5/13/chartex" xmlns:cx8="http://schemas.microsoft.com/office/drawing/2016/5/14/chartex" xmlns:mc="http://schemas.openxmlformats.org/markup-compatibility/2006" xmlns:aink="http://schemas.microsoft.com/office/drawing/2016/ink" xmlns:am3d="http://schemas.microsoft.com/office/drawing/2017/model3d" xmlns:o="urn:schemas-microsoft-com:office:office" xmlns:oel="http://schemas.microsoft.com/office/2019/extlst" xmlns:r="http://schemas.openxmlformats.org/officeDocument/2006/relationships" xmlns:m="http://schemas.openxmlformats.org/officeDocument/2006/math" xmlns:v="urn:schemas-microsoft-com:vml" xmlns:wp14="http://schemas.microsoft.com/office/word/2010/wordprocessingDrawing" xmlns:wp="http://schemas.openxmlformats.org/drawingml/2006/wordprocessingDrawing" xmlns:w10="urn:schemas-microsoft-com:office:word" xmlns:w="http://schemas.openxmlformats.org/wordprocessingml/2006/main" xmlns:w14="http://schemas.microsoft.com/office/word/2010/wordml" xmlns:w15="http://schemas.microsoft.com/office/word/2012/wordml" xmlns:w16cex="http://schemas.microsoft.com/office/word/2018/wordml/cex" xmlns:w16cid="http://schemas.microsoft.com/office/word/2016/wordml/cid" xmlns:w16="http://schemas.microsoft.com/office/word/2018/wordml" xmlns:w16sdtdh="http://schemas.microsoft.com/office/word/2020/wordml/sdtdatahash" xmlns:w16se="http://schemas.microsoft.com/office/word/2015/wordml/symex" xmlns:wpg="http://schemas.microsoft.com/office/word/2010/wordprocessingGroup" xmlns:wpi="http://schemas.microsoft.com/office/word/2010/wordprocessingInk" xmlns:wne="http://schemas.microsoft.com/office/word/2006/wordml" xmlns:wps="http://schemas.microsoft.com/office/word/2010/wordprocessingShape" mc:Ignorable="w14 w15 w16se w16cid w16 w16cex w16sdtdh wp14">
+<w:hdr xmlns:wpc="http://schemas.microsoft.com/office/word/2010/wordprocessingCanvas" xmlns:cx="http://schemas.microsoft.com/office/drawing/2014/chartex" xmlns:cx1="http://schemas.microsoft.com/office/drawing/2015/9/8/chartex" xmlns:cx2="http://schemas.microsoft.com/office/drawing/2015/10/21/chartex" xmlns:cx3="http://schemas.microsoft.com/office/drawing/2016/5/9/chartex" xmlns:cx4="http://schemas.microsoft.com/office/drawing/2016/5/10/chartex" xmlns:cx5="http://schemas.microsoft.com/office/drawing/2016/5/11/chartex" xmlns:cx6="http://schemas.microsoft.com/office/drawing/2016/5/12/chartex" xmlns:cx7="http://schemas.microsoft.com/office/drawing/2016/5/13/chartex" xmlns:cx8="http://schemas.microsoft.com/office/drawing/2016/5/14/chartex" xmlns:mc="http://schemas.openxmlformats.org/markup-compatibility/2006" xmlns:aink="http://schemas.microsoft.com/office/drawing/2016/ink" xmlns:am3d="http://schemas.microsoft.com/office/drawing/2017/model3d" xmlns:o="urn:schemas-microsoft-com:office:office" xmlns:oel="http://schemas.microsoft.com/office/2019/extlst" xmlns:r="http://schemas.openxmlformats.org/officeDocument/2006/relationships" xmlns:m="http://schemas.openxmlformats.org/officeDocument/2006/math" xmlns:v="urn:schemas-microsoft-com:vml" xmlns:wp14="http://schemas.microsoft.com/office/word/2010/wordprocessingDrawing" xmlns:wp="http://schemas.openxmlformats.org/drawingml/2006/wordprocessingDrawing" xmlns:w10="urn:schemas-microsoft-com:office:word" xmlns:w="http://schemas.openxmlformats.org/wordprocessingml/2006/main" xmlns:w14="http://schemas.microsoft.com/office/word/2010/wordml" xmlns:w15="http://schemas.microsoft.com/office/word/2012/wordml" xmlns:w16cex="http://schemas.microsoft.com/office/word/2018/wordml/cex" xmlns:w16cid="http://schemas.microsoft.com/office/word/2016/wordml/cid" xmlns:w16="http://schemas.microsoft.com/office/word/2018/wordml" xmlns:w16du="http://schemas.microsoft.com/office/word/2023/wordml/word16du" xmlns:w16sdtdh="http://schemas.microsoft.com/office/word/2020/wordml/sdtdatahash" xmlns:w16sdtfl="http://schemas.microsoft.com/office/word/2024/wordml/sdtformatlock" xmlns:w16se="http://schemas.microsoft.com/office/word/2015/wordml/symex" xmlns:wpg="http://schemas.microsoft.com/office/word/2010/wordprocessingGroup" xmlns:wpi="http://schemas.microsoft.com/office/word/2010/wordprocessingInk" xmlns:wne="http://schemas.microsoft.com/office/word/2006/wordml" xmlns:wps="http://schemas.microsoft.com/office/word/2010/wordprocessingShape" mc:Ignorable="w14 w15 w16se w16cid w16 w16cex w16sdtdh w16sdtfl w16du wp14">
   <w:p>
     <w:pPr>
       <w:pStyle w:val="Cuerpo"/>
@@ -4405,7 +4372,7 @@
 </file>
 
 <file path=word/numbering.xml><?xml version="1.0" encoding="utf-8"?>
-<w:numbering xmlns:wpc="http://schemas.microsoft.com/office/word/2010/wordprocessingCanvas" xmlns:cx="http://schemas.microsoft.com/office/drawing/2014/chartex" xmlns:cx1="http://schemas.microsoft.com/office/drawing/2015/9/8/chartex" xmlns:cx2="http://schemas.microsoft.com/office/drawing/2015/10/21/chartex" xmlns:cx3="http://schemas.microsoft.com/office/drawing/2016/5/9/chartex" xmlns:cx4="http://schemas.microsoft.com/office/drawing/2016/5/10/chartex" xmlns:cx5="http://schemas.microsoft.com/office/drawing/2016/5/11/chartex" xmlns:cx6="http://schemas.microsoft.com/office/drawing/2016/5/12/chartex" xmlns:cx7="http://schemas.microsoft.com/office/drawing/2016/5/13/chartex" xmlns:cx8="http://schemas.microsoft.com/office/drawing/2016/5/14/chartex" xmlns:mc="http://schemas.openxmlformats.org/markup-compatibility/2006" xmlns:aink="http://schemas.microsoft.com/office/drawing/2016/ink" xmlns:am3d="http://schemas.microsoft.com/office/drawing/2017/model3d" xmlns:o="urn:schemas-microsoft-com:office:office" xmlns:oel="http://schemas.microsoft.com/office/2019/extlst" xmlns:r="http://schemas.openxmlformats.org/officeDocument/2006/relationships" xmlns:m="http://schemas.openxmlformats.org/officeDocument/2006/math" xmlns:v="urn:schemas-microsoft-com:vml" xmlns:wp14="http://schemas.microsoft.com/office/word/2010/wordprocessingDrawing" xmlns:wp="http://schemas.openxmlformats.org/drawingml/2006/wordprocessingDrawing" xmlns:w10="urn:schemas-microsoft-com:office:word" xmlns:w="http://schemas.openxmlformats.org/wordprocessingml/2006/main" xmlns:w14="http://schemas.microsoft.com/office/word/2010/wordml" xmlns:w15="http://schemas.microsoft.com/office/word/2012/wordml" xmlns:w16cex="http://schemas.microsoft.com/office/word/2018/wordml/cex" xmlns:w16cid="http://schemas.microsoft.com/office/word/2016/wordml/cid" xmlns:w16="http://schemas.microsoft.com/office/word/2018/wordml" xmlns:w16sdtdh="http://schemas.microsoft.com/office/word/2020/wordml/sdtdatahash" xmlns:w16se="http://schemas.microsoft.com/office/word/2015/wordml/symex" xmlns:wpg="http://schemas.microsoft.com/office/word/2010/wordprocessingGroup" xmlns:wpi="http://schemas.microsoft.com/office/word/2010/wordprocessingInk" xmlns:wne="http://schemas.microsoft.com/office/word/2006/wordml" xmlns:wps="http://schemas.microsoft.com/office/word/2010/wordprocessingShape" mc:Ignorable="w14 w15 w16se w16cid w16 w16cex w16sdtdh wp14">
+<w:numbering xmlns:wpc="http://schemas.microsoft.com/office/word/2010/wordprocessingCanvas" xmlns:cx="http://schemas.microsoft.com/office/drawing/2014/chartex" xmlns:cx1="http://schemas.microsoft.com/office/drawing/2015/9/8/chartex" xmlns:cx2="http://schemas.microsoft.com/office/drawing/2015/10/21/chartex" xmlns:cx3="http://schemas.microsoft.com/office/drawing/2016/5/9/chartex" xmlns:cx4="http://schemas.microsoft.com/office/drawing/2016/5/10/chartex" xmlns:cx5="http://schemas.microsoft.com/office/drawing/2016/5/11/chartex" xmlns:cx6="http://schemas.microsoft.com/office/drawing/2016/5/12/chartex" xmlns:cx7="http://schemas.microsoft.com/office/drawing/2016/5/13/chartex" xmlns:cx8="http://schemas.microsoft.com/office/drawing/2016/5/14/chartex" xmlns:mc="http://schemas.openxmlformats.org/markup-compatibility/2006" xmlns:aink="http://schemas.microsoft.com/office/drawing/2016/ink" xmlns:am3d="http://schemas.microsoft.com/office/drawing/2017/model3d" xmlns:o="urn:schemas-microsoft-com:office:office" xmlns:oel="http://schemas.microsoft.com/office/2019/extlst" xmlns:r="http://schemas.openxmlformats.org/officeDocument/2006/relationships" xmlns:m="http://schemas.openxmlformats.org/officeDocument/2006/math" xmlns:v="urn:schemas-microsoft-com:vml" xmlns:wp14="http://schemas.microsoft.com/office/word/2010/wordprocessingDrawing" xmlns:wp="http://schemas.openxmlformats.org/drawingml/2006/wordprocessingDrawing" xmlns:w10="urn:schemas-microsoft-com:office:word" xmlns:w="http://schemas.openxmlformats.org/wordprocessingml/2006/main" xmlns:w14="http://schemas.microsoft.com/office/word/2010/wordml" xmlns:w15="http://schemas.microsoft.com/office/word/2012/wordml" xmlns:w16cex="http://schemas.microsoft.com/office/word/2018/wordml/cex" xmlns:w16cid="http://schemas.microsoft.com/office/word/2016/wordml/cid" xmlns:w16="http://schemas.microsoft.com/office/word/2018/wordml" xmlns:w16du="http://schemas.microsoft.com/office/word/2023/wordml/word16du" xmlns:w16sdtdh="http://schemas.microsoft.com/office/word/2020/wordml/sdtdatahash" xmlns:w16sdtfl="http://schemas.microsoft.com/office/word/2024/wordml/sdtformatlock" xmlns:w16se="http://schemas.microsoft.com/office/word/2015/wordml/symex" xmlns:wpg="http://schemas.microsoft.com/office/word/2010/wordprocessingGroup" xmlns:wpi="http://schemas.microsoft.com/office/word/2010/wordprocessingInk" xmlns:wne="http://schemas.microsoft.com/office/word/2006/wordml" xmlns:wps="http://schemas.microsoft.com/office/word/2010/wordprocessingShape" mc:Ignorable="w14 w15 w16se w16cid w16 w16cex w16sdtdh w16sdtfl w16du wp14">
   <w:abstractNum w:abstractNumId="0" w15:restartNumberingAfterBreak="0">
     <w:nsid w:val="0CB231D4"/>
     <w:multiLevelType w:val="hybridMultilevel"/>
@@ -5335,7 +5302,7 @@
 </file>
 
 <file path=word/styles.xml><?xml version="1.0" encoding="utf-8"?>
-<w:styles xmlns:mc="http://schemas.openxmlformats.org/markup-compatibility/2006" xmlns:r="http://schemas.openxmlformats.org/officeDocument/2006/relationships" xmlns:w="http://schemas.openxmlformats.org/wordprocessingml/2006/main" xmlns:w14="http://schemas.microsoft.com/office/word/2010/wordml" xmlns:w15="http://schemas.microsoft.com/office/word/2012/wordml" xmlns:w16cex="http://schemas.microsoft.com/office/word/2018/wordml/cex" xmlns:w16cid="http://schemas.microsoft.com/office/word/2016/wordml/cid" xmlns:w16="http://schemas.microsoft.com/office/word/2018/wordml" xmlns:w16sdtdh="http://schemas.microsoft.com/office/word/2020/wordml/sdtdatahash" xmlns:w16se="http://schemas.microsoft.com/office/word/2015/wordml/symex" mc:Ignorable="w14 w15 w16se w16cid w16 w16cex w16sdtdh">
+<w:styles xmlns:mc="http://schemas.openxmlformats.org/markup-compatibility/2006" xmlns:r="http://schemas.openxmlformats.org/officeDocument/2006/relationships" xmlns:w="http://schemas.openxmlformats.org/wordprocessingml/2006/main" xmlns:w14="http://schemas.microsoft.com/office/word/2010/wordml" xmlns:w15="http://schemas.microsoft.com/office/word/2012/wordml" xmlns:w16cex="http://schemas.microsoft.com/office/word/2018/wordml/cex" xmlns:w16cid="http://schemas.microsoft.com/office/word/2016/wordml/cid" xmlns:w16="http://schemas.microsoft.com/office/word/2018/wordml" xmlns:w16du="http://schemas.microsoft.com/office/word/2023/wordml/word16du" xmlns:w16sdtdh="http://schemas.microsoft.com/office/word/2020/wordml/sdtdatahash" xmlns:w16sdtfl="http://schemas.microsoft.com/office/word/2024/wordml/sdtformatlock" xmlns:w16se="http://schemas.microsoft.com/office/word/2015/wordml/symex" mc:Ignorable="w14 w15 w16se w16cid w16 w16cex w16sdtdh w16sdtfl w16du">
   <w:docDefaults>
     <w:rPrDefault>
       <w:rPr>

</xml_diff>